<commit_message>
feat: reorganize content checklist for clarity and consistency in documentation
</commit_message>
<xml_diff>
--- a/docs/CMT-Website-Content-Needed.docx
+++ b/docs/CMT-Website-Content-Needed.docx
@@ -5214,7 +5214,7 @@
                 <w:sz w:val="22"/>
                 <w:szCs w:val="22"/>
               </w:rPr>
-              <w:t xml:space="preserve">Ambassador House from the outside</w:t>
+              <w:t xml:space="preserve">Inside the office</w:t>
             </w:r>
           </w:p>
         </w:tc>
@@ -5246,7 +5246,7 @@
                 <w:sz w:val="20"/>
                 <w:szCs w:val="20"/>
               </w:rPr>
-              <w:t xml:space="preserve">The building seen from the street in daylight, so visitors recognise it when they arrive.</w:t>
+              <w:t xml:space="preserve">The reception and working areas, tidy and well lit.</w:t>
             </w:r>
           </w:p>
         </w:tc>
@@ -5277,7 +5277,7 @@
                 <w:sz w:val="20"/>
                 <w:szCs w:val="20"/>
               </w:rPr>
-              <w:t xml:space="preserve">2 or 3</w:t>
+              <w:t xml:space="preserve">3 to 5</w:t>
             </w:r>
           </w:p>
         </w:tc>
@@ -5379,7 +5379,7 @@
                 <w:sz w:val="22"/>
                 <w:szCs w:val="22"/>
               </w:rPr>
-              <w:t xml:space="preserve">Inside the office</w:t>
+              <w:t xml:space="preserve">Valuers at work</w:t>
             </w:r>
           </w:p>
         </w:tc>
@@ -5410,7 +5410,7 @@
                 <w:sz w:val="20"/>
                 <w:szCs w:val="20"/>
               </w:rPr>
-              <w:t xml:space="preserve">The reception and working areas, tidy and well lit.</w:t>
+              <w:t xml:space="preserve">During an inspection: measuring, checking documents, taking notes on site. Faces do not need to show.</w:t>
             </w:r>
           </w:p>
         </w:tc>
@@ -5440,7 +5440,7 @@
                 <w:sz w:val="20"/>
                 <w:szCs w:val="20"/>
               </w:rPr>
-              <w:t xml:space="preserve">3 to 5</w:t>
+              <w:t xml:space="preserve">5 to 10</w:t>
             </w:r>
           </w:p>
         </w:tc>
@@ -5543,7 +5543,7 @@
                 <w:sz w:val="22"/>
                 <w:szCs w:val="22"/>
               </w:rPr>
-              <w:t xml:space="preserve">Valuers at work</w:t>
+              <w:t xml:space="preserve">Buildings CMT has valued</w:t>
             </w:r>
           </w:p>
         </w:tc>
@@ -5575,7 +5575,7 @@
                 <w:sz w:val="20"/>
                 <w:szCs w:val="20"/>
               </w:rPr>
-              <w:t xml:space="preserve">During an inspection: measuring, checking documents, taking notes on site. Faces do not need to show.</w:t>
+              <w:t xml:space="preserve">Known Kampala buildings CMT has worked on, only where the owner agrees. One could be used at the top of the homepage.</w:t>
             </w:r>
           </w:p>
         </w:tc>
@@ -5606,7 +5606,7 @@
                 <w:sz w:val="20"/>
                 <w:szCs w:val="20"/>
               </w:rPr>
-              <w:t xml:space="preserve">5 to 10</w:t>
+              <w:t xml:space="preserve">3 to 6</w:t>
             </w:r>
           </w:p>
         </w:tc>
@@ -5708,7 +5708,7 @@
                 <w:sz w:val="22"/>
                 <w:szCs w:val="22"/>
               </w:rPr>
-              <w:t xml:space="preserve">Buildings CMT has valued</w:t>
+              <w:t xml:space="preserve">The other offices</w:t>
             </w:r>
           </w:p>
         </w:tc>
@@ -5739,7 +5739,7 @@
                 <w:sz w:val="20"/>
                 <w:szCs w:val="20"/>
               </w:rPr>
-              <w:t xml:space="preserve">Known Kampala buildings CMT has worked on, only where the owner agrees. One could be used at the top of the homepage.</w:t>
+              <w:t xml:space="preserve">Gulu, Mbale and Mbarara, and the Kenya offices if they should appear on the site.</w:t>
             </w:r>
           </w:p>
         </w:tc>
@@ -5769,7 +5769,7 @@
                 <w:sz w:val="20"/>
                 <w:szCs w:val="20"/>
               </w:rPr>
-              <w:t xml:space="preserve">3 to 6</w:t>
+              <w:t xml:space="preserve">1 per office</w:t>
             </w:r>
           </w:p>
         </w:tc>
@@ -5782,173 +5782,6 @@
               <w:bottom w:val="single" w:color="E0DED6" w:sz="4"/>
               <w:right w:val="single" w:color="E0DED6" w:sz="4"/>
             </w:tcBorders>
-            <w:tcMar>
-              <w:top w:type="dxa" w:w="90"/>
-              <w:left w:type="dxa" w:w="120"/>
-              <w:bottom w:type="dxa" w:w="90"/>
-              <w:right w:type="dxa" w:w="120"/>
-            </w:tcMar>
-          </w:tcPr>
-          <w:p>
-            <w:pPr>
-              <w:spacing w:after="0" w:before="0" w:line="300"/>
-              <w:jc w:val="center"/>
-            </w:pPr>
-            <w:r>
-              <w:rPr>
-                <w:rFonts w:ascii="Calibri" w:cs="Calibri" w:eastAsia="Calibri" w:hAnsi="Calibri"/>
-                <w:sz w:val="28"/>
-                <w:szCs w:val="28"/>
-              </w:rPr>
-              <w:t xml:space="preserve">☐</w:t>
-            </w:r>
-          </w:p>
-        </w:tc>
-      </w:tr>
-      <w:tr>
-        <w:trPr>
-          <w:cantSplit/>
-        </w:trPr>
-        <w:tc>
-          <w:tcPr>
-            <w:tcW w:type="dxa" w:w="760"/>
-            <w:tcBorders>
-              <w:top w:val="single" w:color="E0DED6" w:sz="4"/>
-              <w:left w:val="single" w:color="E0DED6" w:sz="4"/>
-              <w:bottom w:val="single" w:color="E0DED6" w:sz="4"/>
-              <w:right w:val="single" w:color="E0DED6" w:sz="4"/>
-            </w:tcBorders>
-            <w:shd w:fill="F7F4EC" w:color="auto" w:val="clear"/>
-            <w:tcMar>
-              <w:top w:type="dxa" w:w="90"/>
-              <w:left w:type="dxa" w:w="120"/>
-              <w:bottom w:type="dxa" w:w="90"/>
-              <w:right w:type="dxa" w:w="120"/>
-            </w:tcMar>
-          </w:tcPr>
-          <w:p>
-            <w:pPr>
-              <w:spacing w:after="0" w:before="0" w:line="300"/>
-            </w:pPr>
-            <w:r>
-              <w:rPr>
-                <w:rFonts w:ascii="Calibri" w:cs="Calibri" w:eastAsia="Calibri" w:hAnsi="Calibri"/>
-                <w:b/>
-                <w:bCs/>
-                <w:color w:val="7D6003"/>
-                <w:sz w:val="22"/>
-                <w:szCs w:val="22"/>
-              </w:rPr>
-              <w:t xml:space="preserve">6.7</w:t>
-            </w:r>
-          </w:p>
-        </w:tc>
-        <w:tc>
-          <w:tcPr>
-            <w:tcW w:type="dxa" w:w="3300"/>
-            <w:tcBorders>
-              <w:top w:val="single" w:color="E0DED6" w:sz="4"/>
-              <w:left w:val="single" w:color="E0DED6" w:sz="4"/>
-              <w:bottom w:val="single" w:color="E0DED6" w:sz="4"/>
-              <w:right w:val="single" w:color="E0DED6" w:sz="4"/>
-            </w:tcBorders>
-            <w:shd w:fill="F7F4EC" w:color="auto" w:val="clear"/>
-            <w:tcMar>
-              <w:top w:type="dxa" w:w="90"/>
-              <w:left w:type="dxa" w:w="120"/>
-              <w:bottom w:type="dxa" w:w="90"/>
-              <w:right w:type="dxa" w:w="120"/>
-            </w:tcMar>
-          </w:tcPr>
-          <w:p>
-            <w:pPr>
-              <w:spacing w:after="0" w:before="0" w:line="300"/>
-            </w:pPr>
-            <w:r>
-              <w:rPr>
-                <w:rFonts w:ascii="Calibri" w:cs="Calibri" w:eastAsia="Calibri" w:hAnsi="Calibri"/>
-                <w:b/>
-                <w:bCs/>
-                <w:sz w:val="22"/>
-                <w:szCs w:val="22"/>
-              </w:rPr>
-              <w:t xml:space="preserve">The other offices</w:t>
-            </w:r>
-          </w:p>
-        </w:tc>
-        <w:tc>
-          <w:tcPr>
-            <w:tcW w:type="dxa" w:w="3700"/>
-            <w:tcBorders>
-              <w:top w:val="single" w:color="E0DED6" w:sz="4"/>
-              <w:left w:val="single" w:color="E0DED6" w:sz="4"/>
-              <w:bottom w:val="single" w:color="E0DED6" w:sz="4"/>
-              <w:right w:val="single" w:color="E0DED6" w:sz="4"/>
-            </w:tcBorders>
-            <w:shd w:fill="F7F4EC" w:color="auto" w:val="clear"/>
-            <w:tcMar>
-              <w:top w:type="dxa" w:w="90"/>
-              <w:left w:type="dxa" w:w="120"/>
-              <w:bottom w:type="dxa" w:w="90"/>
-              <w:right w:type="dxa" w:w="120"/>
-            </w:tcMar>
-          </w:tcPr>
-          <w:p>
-            <w:pPr>
-              <w:spacing w:after="0" w:before="0" w:line="300"/>
-            </w:pPr>
-            <w:r>
-              <w:rPr>
-                <w:rFonts w:ascii="Calibri" w:cs="Calibri" w:eastAsia="Calibri" w:hAnsi="Calibri"/>
-                <w:color w:val="566059"/>
-                <w:sz w:val="20"/>
-                <w:szCs w:val="20"/>
-              </w:rPr>
-              <w:t xml:space="preserve">Gulu, Mbale and Mbarara, and the Kenya offices if they should appear on the site.</w:t>
-            </w:r>
-          </w:p>
-        </w:tc>
-        <w:tc>
-          <w:tcPr>
-            <w:tcW w:type="dxa" w:w="1100"/>
-            <w:tcBorders>
-              <w:top w:val="single" w:color="E0DED6" w:sz="4"/>
-              <w:left w:val="single" w:color="E0DED6" w:sz="4"/>
-              <w:bottom w:val="single" w:color="E0DED6" w:sz="4"/>
-              <w:right w:val="single" w:color="E0DED6" w:sz="4"/>
-            </w:tcBorders>
-            <w:shd w:fill="F7F4EC" w:color="auto" w:val="clear"/>
-            <w:tcMar>
-              <w:top w:type="dxa" w:w="90"/>
-              <w:left w:type="dxa" w:w="120"/>
-              <w:bottom w:type="dxa" w:w="90"/>
-              <w:right w:type="dxa" w:w="120"/>
-            </w:tcMar>
-          </w:tcPr>
-          <w:p>
-            <w:pPr>
-              <w:spacing w:after="0" w:before="0" w:line="300"/>
-            </w:pPr>
-            <w:r>
-              <w:rPr>
-                <w:rFonts w:ascii="Calibri" w:cs="Calibri" w:eastAsia="Calibri" w:hAnsi="Calibri"/>
-                <w:sz w:val="20"/>
-                <w:szCs w:val="20"/>
-              </w:rPr>
-              <w:t xml:space="preserve">1 per office</w:t>
-            </w:r>
-          </w:p>
-        </w:tc>
-        <w:tc>
-          <w:tcPr>
-            <w:tcW w:type="dxa" w:w="778"/>
-            <w:tcBorders>
-              <w:top w:val="single" w:color="E0DED6" w:sz="4"/>
-              <w:left w:val="single" w:color="E0DED6" w:sz="4"/>
-              <w:bottom w:val="single" w:color="E0DED6" w:sz="4"/>
-              <w:right w:val="single" w:color="E0DED6" w:sz="4"/>
-            </w:tcBorders>
-            <w:shd w:fill="F7F4EC" w:color="auto" w:val="clear"/>
             <w:tcMar>
               <w:top w:type="dxa" w:w="90"/>
               <w:left w:type="dxa" w:w="120"/>
@@ -6372,138 +6205,6 @@
           </w:p>
         </w:tc>
       </w:tr>
-      <w:tr>
-        <w:trPr>
-          <w:cantSplit/>
-        </w:trPr>
-        <w:tc>
-          <w:tcPr>
-            <w:tcW w:type="dxa" w:w="760"/>
-            <w:tcBorders>
-              <w:top w:val="single" w:color="E0DED6" w:sz="4"/>
-              <w:left w:val="single" w:color="E0DED6" w:sz="4"/>
-              <w:bottom w:val="single" w:color="E0DED6" w:sz="4"/>
-              <w:right w:val="single" w:color="E0DED6" w:sz="4"/>
-            </w:tcBorders>
-            <w:tcMar>
-              <w:top w:type="dxa" w:w="90"/>
-              <w:left w:type="dxa" w:w="120"/>
-              <w:bottom w:type="dxa" w:w="90"/>
-              <w:right w:type="dxa" w:w="120"/>
-            </w:tcMar>
-          </w:tcPr>
-          <w:p>
-            <w:pPr>
-              <w:spacing w:after="0" w:before="0" w:line="300"/>
-            </w:pPr>
-            <w:r>
-              <w:rPr>
-                <w:rFonts w:ascii="Calibri" w:cs="Calibri" w:eastAsia="Calibri" w:hAnsi="Calibri"/>
-                <w:b/>
-                <w:bCs/>
-                <w:color w:val="7D6003"/>
-                <w:sz w:val="22"/>
-                <w:szCs w:val="22"/>
-              </w:rPr>
-              <w:t xml:space="preserve">7.2</w:t>
-            </w:r>
-          </w:p>
-        </w:tc>
-        <w:tc>
-          <w:tcPr>
-            <w:tcW w:type="dxa" w:w="5100"/>
-            <w:tcBorders>
-              <w:top w:val="single" w:color="E0DED6" w:sz="4"/>
-              <w:left w:val="single" w:color="E0DED6" w:sz="4"/>
-              <w:bottom w:val="single" w:color="E0DED6" w:sz="4"/>
-              <w:right w:val="single" w:color="E0DED6" w:sz="4"/>
-            </w:tcBorders>
-            <w:tcMar>
-              <w:top w:type="dxa" w:w="90"/>
-              <w:left w:type="dxa" w:w="120"/>
-              <w:bottom w:type="dxa" w:w="90"/>
-              <w:right w:type="dxa" w:w="120"/>
-            </w:tcMar>
-          </w:tcPr>
-          <w:p>
-            <w:pPr>
-              <w:spacing w:after="0" w:before="0" w:line="300"/>
-            </w:pPr>
-            <w:r>
-              <w:rPr>
-                <w:rFonts w:ascii="Calibri" w:cs="Calibri" w:eastAsia="Calibri" w:hAnsi="Calibri"/>
-                <w:b/>
-                <w:bCs/>
-                <w:sz w:val="22"/>
-                <w:szCs w:val="22"/>
-              </w:rPr>
-              <w:t xml:space="preserve">Clearer logo files for KCB, Stanbic, UBA and VisionFund</w:t>
-            </w:r>
-          </w:p>
-        </w:tc>
-        <w:tc>
-          <w:tcPr>
-            <w:tcW w:type="dxa" w:w="3000"/>
-            <w:tcBorders>
-              <w:top w:val="single" w:color="E0DED6" w:sz="4"/>
-              <w:left w:val="single" w:color="E0DED6" w:sz="4"/>
-              <w:bottom w:val="single" w:color="E0DED6" w:sz="4"/>
-              <w:right w:val="single" w:color="E0DED6" w:sz="4"/>
-            </w:tcBorders>
-            <w:tcMar>
-              <w:top w:type="dxa" w:w="90"/>
-              <w:left w:type="dxa" w:w="120"/>
-              <w:bottom w:type="dxa" w:w="90"/>
-              <w:right w:type="dxa" w:w="120"/>
-            </w:tcMar>
-          </w:tcPr>
-          <w:p>
-            <w:pPr>
-              <w:spacing w:after="0" w:before="0" w:line="300"/>
-            </w:pPr>
-            <w:r>
-              <w:rPr>
-                <w:rFonts w:ascii="Calibri" w:cs="Calibri" w:eastAsia="Calibri" w:hAnsi="Calibri"/>
-                <w:color w:val="566059"/>
-                <w:sz w:val="20"/>
-                <w:szCs w:val="20"/>
-              </w:rPr>
-              <w:t xml:space="preserve">The versions we have are small and look slightly blurry on sharp screens.</w:t>
-            </w:r>
-          </w:p>
-        </w:tc>
-        <w:tc>
-          <w:tcPr>
-            <w:tcW w:type="dxa" w:w="778"/>
-            <w:tcBorders>
-              <w:top w:val="single" w:color="E0DED6" w:sz="4"/>
-              <w:left w:val="single" w:color="E0DED6" w:sz="4"/>
-              <w:bottom w:val="single" w:color="E0DED6" w:sz="4"/>
-              <w:right w:val="single" w:color="E0DED6" w:sz="4"/>
-            </w:tcBorders>
-            <w:tcMar>
-              <w:top w:type="dxa" w:w="90"/>
-              <w:left w:type="dxa" w:w="120"/>
-              <w:bottom w:type="dxa" w:w="90"/>
-              <w:right w:type="dxa" w:w="120"/>
-            </w:tcMar>
-          </w:tcPr>
-          <w:p>
-            <w:pPr>
-              <w:spacing w:after="0" w:before="0" w:line="300"/>
-              <w:jc w:val="center"/>
-            </w:pPr>
-            <w:r>
-              <w:rPr>
-                <w:rFonts w:ascii="Calibri" w:cs="Calibri" w:eastAsia="Calibri" w:hAnsi="Calibri"/>
-                <w:sz w:val="28"/>
-                <w:szCs w:val="28"/>
-              </w:rPr>
-              <w:t xml:space="preserve">☐</w:t>
-            </w:r>
-          </w:p>
-        </w:tc>
-      </w:tr>
     </w:tbl>
     <w:p>
       <w:pPr>
@@ -6976,107 +6677,6 @@
       <w:pPr>
         <w:spacing w:after="200"/>
       </w:pPr>
-    </w:p>
-    <w:p>
-      <w:pPr>
-        <w:pStyle w:val="Heading1"/>
-        <w:keepNext/>
-        <w:spacing w:after="120" w:before="360"/>
-      </w:pPr>
-      <w:r>
-        <w:rPr>
-          <w:rFonts w:ascii="Calibri" w:cs="Calibri" w:eastAsia="Calibri" w:hAnsi="Calibri"/>
-          <w:b/>
-          <w:bCs/>
-          <w:color w:val="7D6003"/>
-          <w:sz w:val="32"/>
-          <w:szCs w:val="32"/>
-        </w:rPr>
-        <w:t xml:space="preserve">9.  </w:t>
-      </w:r>
-      <w:r>
-        <w:rPr>
-          <w:rFonts w:ascii="Calibri" w:cs="Calibri" w:eastAsia="Calibri" w:hAnsi="Calibri"/>
-          <w:b/>
-          <w:bCs/>
-          <w:color w:val="11341B"/>
-          <w:sz w:val="32"/>
-          <w:szCs w:val="32"/>
-        </w:rPr>
-        <w:t xml:space="preserve">How to send things to us</w:t>
-      </w:r>
-    </w:p>
-    <w:p>
-      <w:pPr>
-        <w:spacing w:after="120" w:before="0" w:line="300"/>
-      </w:pPr>
-      <w:r>
-        <w:rPr>
-          <w:rFonts w:ascii="Calibri" w:cs="Calibri" w:eastAsia="Calibri" w:hAnsi="Calibri"/>
-          <w:b/>
-          <w:bCs/>
-          <w:color w:val="7D6003"/>
-          <w:sz w:val="22"/>
-          <w:szCs w:val="22"/>
-        </w:rPr>
-        <w:t xml:space="preserve">•  </w:t>
-      </w:r>
-      <w:r>
-        <w:rPr>
-          <w:rFonts w:ascii="Calibri" w:cs="Calibri" w:eastAsia="Calibri" w:hAnsi="Calibri"/>
-          <w:sz w:val="22"/>
-          <w:szCs w:val="22"/>
-        </w:rPr>
-        <w:t xml:space="preserve">By email, or in a shared folder such as Google Drive. Whatever is easiest for you.</w:t>
-      </w:r>
-    </w:p>
-    <w:p>
-      <w:pPr>
-        <w:spacing w:after="120" w:before="0" w:line="300"/>
-      </w:pPr>
-      <w:r>
-        <w:rPr>
-          <w:rFonts w:ascii="Calibri" w:cs="Calibri" w:eastAsia="Calibri" w:hAnsi="Calibri"/>
-          <w:b/>
-          <w:bCs/>
-          <w:color w:val="7D6003"/>
-          <w:sz w:val="22"/>
-          <w:szCs w:val="22"/>
-        </w:rPr>
-        <w:t xml:space="preserve">•  </w:t>
-      </w:r>
-      <w:r>
-        <w:rPr>
-          <w:rFonts w:ascii="Calibri" w:cs="Calibri" w:eastAsia="Calibri" w:hAnsi="Calibri"/>
-          <w:sz w:val="22"/>
-          <w:szCs w:val="22"/>
-        </w:rPr>
-        <w:t xml:space="preserve">Please mention the item number, or use it in the file name, for example "6.1 Godfrey Omondi.jpg".</w:t>
-      </w:r>
-    </w:p>
-    <w:p>
-      <w:pPr>
-        <w:spacing w:after="240" w:before="0" w:line="300"/>
-      </w:pPr>
-      <w:r>
-        <w:rPr>
-          <w:rFonts w:ascii="Calibri" w:cs="Calibri" w:eastAsia="Calibri" w:hAnsi="Calibri"/>
-          <w:b/>
-          <w:bCs/>
-          <w:color w:val="7D6003"/>
-          <w:sz w:val="22"/>
-          <w:szCs w:val="22"/>
-        </w:rPr>
-        <w:t xml:space="preserve">•  </w:t>
-      </w:r>
-      <w:r>
-        <w:rPr>
-          <w:rFonts w:ascii="Calibri" w:cs="Calibri" w:eastAsia="Calibri" w:hAnsi="Calibri"/>
-          <w:sz w:val="22"/>
-          <w:szCs w:val="22"/>
-        </w:rPr>
-        <w:t xml:space="preserve">Send things as they are ready. A partial answer now is more useful than a complete one later.</w:t>
-      </w:r>
     </w:p>
     <w:p>
       <w:pPr>

</xml_diff>

<commit_message>
feat: adopt hero design site-wide and wire public pages to the CMS
- Rebuild the homepage, header and footer to the client's Hero.html design
  (Fraunces + Inter, ink/gold/paper, pill nav and buttons, report-card hero)
- Carry the design through every public page with shared Section, Plate,
  FactStrip, ProcessSteps and PageHeader building blocks
- Read listings, team, partners, testimonials, posts and office contact
  details through src/lib/content.ts so CMS edits reach the site
- Add migration 0003 (agents.listed, agents.signs_reports) and CMS controls
- Remove placeholder "Valued by CMT" dates from mock listings
- Portal dropdown lists above the page with a single z-index scale
- Replace hand-drawn icons with Lucide paths; remove dead hero code and CSS
</commit_message>
<xml_diff>
--- a/docs/CMT-Website-Content-Needed.docx
+++ b/docs/CMT-Website-Content-Needed.docx
@@ -66,7 +66,20 @@
           <w:sz w:val="22"/>
           <w:szCs w:val="22"/>
         </w:rPr>
-        <w:t xml:space="preserve">Thank you for your help so far. The new website is built and works well on phones and computers. To finish it, we need a few things that only CMT can give us: some facts, some photographs and a couple of decisions.</w:t>
+        <w:t xml:space="preserve">Thank you for the staff list and the client list. Both are now on the website: your six registered valuers on the Our People page, and all your clients on the Our Clients page.</w:t>
+      </w:r>
+    </w:p>
+    <w:p>
+      <w:pPr>
+        <w:spacing w:after="160" w:before="0" w:line="300"/>
+      </w:pPr>
+      <w:r>
+        <w:rPr>
+          <w:rFonts w:ascii="Calibri" w:cs="Calibri" w:eastAsia="Calibri" w:hAnsi="Calibri"/>
+          <w:sz w:val="22"/>
+          <w:szCs w:val="22"/>
+        </w:rPr>
+        <w:t xml:space="preserve">To finish the website, we need a few more things that only CMT can give us: some facts, some photographs and a couple of decisions.</w:t>
       </w:r>
     </w:p>
     <w:p>
@@ -372,7 +385,7 @@
                 <w:sz w:val="22"/>
                 <w:szCs w:val="22"/>
               </w:rPr>
-              <w:t xml:space="preserve">Registration numbers for CMT and its valuers</w:t>
+              <w:t xml:space="preserve">Registration numbers for the six registered valuers</w:t>
             </w:r>
           </w:p>
         </w:tc>
@@ -1489,7 +1502,7 @@
           <w:sz w:val="22"/>
           <w:szCs w:val="22"/>
         </w:rPr>
-        <w:t xml:space="preserve">This section shows clients why CMT can be trusted, so it needs to be exactly right. Until we hear from you, the site shows these as "Awaiting confirmation" and does not show any numbers.</w:t>
+        <w:t xml:space="preserve">Thank you for confirming that six of your valuers are registered with the Surveyors Registration Board. The website now says so. What it still needs is the registration numbers, so a bank or a court can check them.</w:t>
       </w:r>
     </w:p>
     <w:tbl>
@@ -1723,7 +1736,7 @@
                 <w:sz w:val="22"/>
                 <w:szCs w:val="22"/>
               </w:rPr>
-              <w:t xml:space="preserve">Godfrey Omondi: please send his registration numbers and how he would like his qualifications written</w:t>
+              <w:t xml:space="preserve">Registration numbers for the six registered valuers</w:t>
             </w:r>
           </w:p>
         </w:tc>
@@ -1755,7 +1768,7 @@
                 <w:sz w:val="20"/>
                 <w:szCs w:val="20"/>
               </w:rPr>
-              <w:t xml:space="preserve">Public records list him as MRICS, licensed by the Surveyors Registration Board (Uganda) and the Institution of Surveyors of Kenya.</w:t>
+              <w:t xml:space="preserve">Godfrey Omondi, Michael Oballim, Rachel Nanyunja, Stella Namujumbi, Joan Nakalanda and Ronald Kidega. Until we have them, the site says "Registered" with no number.</w:t>
             </w:r>
           </w:p>
         </w:tc>
@@ -1857,7 +1870,7 @@
                 <w:sz w:val="22"/>
                 <w:szCs w:val="22"/>
               </w:rPr>
-              <w:t xml:space="preserve">Michael Oballim: please confirm he is FISU, and send his registration number</w:t>
+              <w:t xml:space="preserve">Godfrey Omondi: please confirm MRICS and his Kenya licence</w:t>
             </w:r>
           </w:p>
         </w:tc>
@@ -1888,7 +1901,7 @@
                 <w:sz w:val="20"/>
                 <w:szCs w:val="20"/>
               </w:rPr>
-              <w:t xml:space="preserve">FISU means Fellow of the Institution of Surveyors of Uganda.</w:t>
+              <w:t xml:space="preserve">Public records show him as a Member of the Royal Institution of Chartered Surveyors (MRICS) and licensed by the Institution of Surveyors of Kenya. Please also tell us how he would like his qualifications written.</w:t>
             </w:r>
           </w:p>
         </w:tc>
@@ -1991,7 +2004,7 @@
                 <w:sz w:val="22"/>
                 <w:szCs w:val="22"/>
               </w:rPr>
-              <w:t xml:space="preserve">Does CMT have its own registration as a firm?</w:t>
+              <w:t xml:space="preserve">Michael Oballim: please confirm he is FISU</w:t>
             </w:r>
           </w:p>
         </w:tc>
@@ -2023,7 +2036,7 @@
                 <w:sz w:val="20"/>
                 <w:szCs w:val="20"/>
               </w:rPr>
-              <w:t xml:space="preserve">If so, please send the details. This is separate from the valuers’ own registrations.</w:t>
+              <w:t xml:space="preserve">FISU means Fellow of the Institution of Surveyors of Uganda. We found this in public records, not from CMT.</w:t>
             </w:r>
           </w:p>
         </w:tc>
@@ -2125,7 +2138,7 @@
                 <w:sz w:val="22"/>
                 <w:szCs w:val="22"/>
               </w:rPr>
-              <w:t xml:space="preserve">Does CMT, or any of its valuers, belong to any other professional bodies?</w:t>
+              <w:t xml:space="preserve">Is CMT a member of the Uganda Institution of Surveyors?</w:t>
             </w:r>
           </w:p>
         </w:tc>
@@ -2156,7 +2169,7 @@
                 <w:sz w:val="20"/>
                 <w:szCs w:val="20"/>
               </w:rPr>
-              <w:t xml:space="preserve">We would be glad to add them.</w:t>
+              <w:t xml:space="preserve">The website used to say CMT is regulated by it. It now names the Surveyors Registration Board instead. If CMT is also a member of the Institution, we will mention both.</w:t>
             </w:r>
           </w:p>
         </w:tc>
@@ -2259,7 +2272,7 @@
                 <w:sz w:val="22"/>
                 <w:szCs w:val="22"/>
               </w:rPr>
-              <w:t xml:space="preserve">Optional: what level of professional indemnity insurance does CMT hold?</w:t>
+              <w:t xml:space="preserve">Does CMT have its own registration as a firm?</w:t>
             </w:r>
           </w:p>
         </w:tc>
@@ -2291,6 +2304,139 @@
                 <w:sz w:val="20"/>
                 <w:szCs w:val="20"/>
               </w:rPr>
+              <w:t xml:space="preserve">If so, please send the details. This is separate from the valuers’ own registrations.</w:t>
+            </w:r>
+          </w:p>
+        </w:tc>
+        <w:tc>
+          <w:tcPr>
+            <w:tcW w:type="dxa" w:w="778"/>
+            <w:tcBorders>
+              <w:top w:val="single" w:color="E0DED6" w:sz="4"/>
+              <w:left w:val="single" w:color="E0DED6" w:sz="4"/>
+              <w:bottom w:val="single" w:color="E0DED6" w:sz="4"/>
+              <w:right w:val="single" w:color="E0DED6" w:sz="4"/>
+            </w:tcBorders>
+            <w:shd w:fill="F7F4EC" w:color="auto" w:val="clear"/>
+            <w:tcMar>
+              <w:top w:type="dxa" w:w="90"/>
+              <w:left w:type="dxa" w:w="120"/>
+              <w:bottom w:type="dxa" w:w="90"/>
+              <w:right w:type="dxa" w:w="120"/>
+            </w:tcMar>
+          </w:tcPr>
+          <w:p>
+            <w:pPr>
+              <w:spacing w:after="0" w:before="0" w:line="300"/>
+              <w:jc w:val="center"/>
+            </w:pPr>
+            <w:r>
+              <w:rPr>
+                <w:rFonts w:ascii="Calibri" w:cs="Calibri" w:eastAsia="Calibri" w:hAnsi="Calibri"/>
+                <w:sz w:val="28"/>
+                <w:szCs w:val="28"/>
+              </w:rPr>
+              <w:t xml:space="preserve">☐</w:t>
+            </w:r>
+          </w:p>
+        </w:tc>
+      </w:tr>
+      <w:tr>
+        <w:trPr>
+          <w:cantSplit/>
+        </w:trPr>
+        <w:tc>
+          <w:tcPr>
+            <w:tcW w:type="dxa" w:w="760"/>
+            <w:tcBorders>
+              <w:top w:val="single" w:color="E0DED6" w:sz="4"/>
+              <w:left w:val="single" w:color="E0DED6" w:sz="4"/>
+              <w:bottom w:val="single" w:color="E0DED6" w:sz="4"/>
+              <w:right w:val="single" w:color="E0DED6" w:sz="4"/>
+            </w:tcBorders>
+            <w:tcMar>
+              <w:top w:type="dxa" w:w="90"/>
+              <w:left w:type="dxa" w:w="120"/>
+              <w:bottom w:type="dxa" w:w="90"/>
+              <w:right w:type="dxa" w:w="120"/>
+            </w:tcMar>
+          </w:tcPr>
+          <w:p>
+            <w:pPr>
+              <w:spacing w:after="0" w:before="0" w:line="300"/>
+            </w:pPr>
+            <w:r>
+              <w:rPr>
+                <w:rFonts w:ascii="Calibri" w:cs="Calibri" w:eastAsia="Calibri" w:hAnsi="Calibri"/>
+                <w:b/>
+                <w:bCs/>
+                <w:color w:val="7D6003"/>
+                <w:sz w:val="22"/>
+                <w:szCs w:val="22"/>
+              </w:rPr>
+              <w:t xml:space="preserve">2.6</w:t>
+            </w:r>
+          </w:p>
+        </w:tc>
+        <w:tc>
+          <w:tcPr>
+            <w:tcW w:type="dxa" w:w="5100"/>
+            <w:tcBorders>
+              <w:top w:val="single" w:color="E0DED6" w:sz="4"/>
+              <w:left w:val="single" w:color="E0DED6" w:sz="4"/>
+              <w:bottom w:val="single" w:color="E0DED6" w:sz="4"/>
+              <w:right w:val="single" w:color="E0DED6" w:sz="4"/>
+            </w:tcBorders>
+            <w:tcMar>
+              <w:top w:type="dxa" w:w="90"/>
+              <w:left w:type="dxa" w:w="120"/>
+              <w:bottom w:type="dxa" w:w="90"/>
+              <w:right w:type="dxa" w:w="120"/>
+            </w:tcMar>
+          </w:tcPr>
+          <w:p>
+            <w:pPr>
+              <w:spacing w:after="0" w:before="0" w:line="300"/>
+            </w:pPr>
+            <w:r>
+              <w:rPr>
+                <w:rFonts w:ascii="Calibri" w:cs="Calibri" w:eastAsia="Calibri" w:hAnsi="Calibri"/>
+                <w:b/>
+                <w:bCs/>
+                <w:sz w:val="22"/>
+                <w:szCs w:val="22"/>
+              </w:rPr>
+              <w:t xml:space="preserve">Optional: what level of professional indemnity insurance does CMT hold?</w:t>
+            </w:r>
+          </w:p>
+        </w:tc>
+        <w:tc>
+          <w:tcPr>
+            <w:tcW w:type="dxa" w:w="3000"/>
+            <w:tcBorders>
+              <w:top w:val="single" w:color="E0DED6" w:sz="4"/>
+              <w:left w:val="single" w:color="E0DED6" w:sz="4"/>
+              <w:bottom w:val="single" w:color="E0DED6" w:sz="4"/>
+              <w:right w:val="single" w:color="E0DED6" w:sz="4"/>
+            </w:tcBorders>
+            <w:tcMar>
+              <w:top w:type="dxa" w:w="90"/>
+              <w:left w:type="dxa" w:w="120"/>
+              <w:bottom w:type="dxa" w:w="90"/>
+              <w:right w:type="dxa" w:w="120"/>
+            </w:tcMar>
+          </w:tcPr>
+          <w:p>
+            <w:pPr>
+              <w:spacing w:after="0" w:before="0" w:line="300"/>
+            </w:pPr>
+            <w:r>
+              <w:rPr>
+                <w:rFonts w:ascii="Calibri" w:cs="Calibri" w:eastAsia="Calibri" w:hAnsi="Calibri"/>
+                <w:color w:val="566059"/>
+                <w:sz w:val="20"/>
+                <w:szCs w:val="20"/>
+              </w:rPr>
               <w:t xml:space="preserve">Banks often ask about this before adding a valuer to their panel.</w:t>
             </w:r>
           </w:p>
@@ -2304,7 +2450,6 @@
               <w:bottom w:val="single" w:color="E0DED6" w:sz="4"/>
               <w:right w:val="single" w:color="E0DED6" w:sz="4"/>
             </w:tcBorders>
-            <w:shd w:fill="F7F4EC" w:color="auto" w:val="clear"/>
             <w:tcMar>
               <w:top w:type="dxa" w:w="90"/>
               <w:left w:type="dxa" w:w="120"/>
@@ -2375,7 +2520,7 @@
           <w:sz w:val="22"/>
           <w:szCs w:val="22"/>
         </w:rPr>
-        <w:t xml:space="preserve">The people shown on the Our People page. Their photographs are covered in Section 6.</w:t>
+        <w:t xml:space="preserve">The Our People page now shows your two Technical Directors and four registered valuers. Their photographs are covered in Section 6.</w:t>
       </w:r>
     </w:p>
     <w:tbl>
@@ -2609,7 +2754,7 @@
                 <w:sz w:val="22"/>
                 <w:szCs w:val="22"/>
               </w:rPr>
-              <w:t xml:space="preserve">Please confirm everyone’s exact job title</w:t>
+              <w:t xml:space="preserve">How is Stella’s surname spelled: Namujumbi or Namujjumbi?</w:t>
             </w:r>
           </w:p>
         </w:tc>
@@ -2641,7 +2786,7 @@
                 <w:sz w:val="20"/>
                 <w:szCs w:val="20"/>
               </w:rPr>
-              <w:t xml:space="preserve">In particular Michael Oballim’s, which we found in a business directory rather than from CMT.</w:t>
+              <w:t xml:space="preserve">Your staff list writes "Namujumbi", but her email address and earlier CMT material use "Namujjumbi".</w:t>
             </w:r>
           </w:p>
         </w:tc>
@@ -2743,7 +2888,7 @@
                 <w:sz w:val="22"/>
                 <w:szCs w:val="22"/>
               </w:rPr>
-              <w:t xml:space="preserve">Please read each person’s short description and tell us about any changes</w:t>
+              <w:t xml:space="preserve">A line about each valuer’s experience (optional)</w:t>
             </w:r>
           </w:p>
         </w:tc>
@@ -2774,7 +2919,7 @@
                 <w:sz w:val="20"/>
                 <w:szCs w:val="20"/>
               </w:rPr>
-              <w:t xml:space="preserve">You can see them on the Our People page.</w:t>
+              <w:t xml:space="preserve">For example, the kinds of property they value most, or their years in practice. At the moment the site says only that they are registered valuers.</w:t>
             </w:r>
           </w:p>
         </w:tc>
@@ -2877,7 +3022,7 @@
                 <w:sz w:val="22"/>
                 <w:szCs w:val="22"/>
               </w:rPr>
-              <w:t xml:space="preserve">Should Namujjumbi Stella and Kingsley Adams appear on the site?</w:t>
+              <w:t xml:space="preserve">Are Kanshabe Lindah and Waniala Andrew still with CMT?</w:t>
             </w:r>
           </w:p>
         </w:tc>
@@ -2909,7 +3054,7 @@
                 <w:sz w:val="20"/>
                 <w:szCs w:val="20"/>
               </w:rPr>
-              <w:t xml:space="preserve">CMT’s own material mentions them as valuers. If yes, please send their job titles, a line about their work and a photo.</w:t>
+              <w:t xml:space="preserve">They were listed as property agents on the old website but are not on your staff list, so we have taken them off the site for now. We can add them back in minutes.</w:t>
             </w:r>
           </w:p>
         </w:tc>
@@ -3011,7 +3156,7 @@
                 <w:sz w:val="22"/>
                 <w:szCs w:val="22"/>
               </w:rPr>
-              <w:t xml:space="preserve">Should anyone be contacted directly?</w:t>
+              <w:t xml:space="preserve">Who works in the Kenya practice?</w:t>
             </w:r>
           </w:p>
         </w:tc>
@@ -3042,7 +3187,7 @@
                 <w:sz w:val="20"/>
                 <w:szCs w:val="20"/>
               </w:rPr>
-              <w:t xml:space="preserve">If so, please send their direct phone number or email. Otherwise, all enquiries go through the office, as they do now.</w:t>
+              <w:t xml:space="preserve">Your staff list covers the Uganda team only. If the Kenya team should appear, please send their names and titles.</w:t>
             </w:r>
           </w:p>
         </w:tc>
@@ -3860,7 +4005,7 @@
           <w:sz w:val="22"/>
           <w:szCs w:val="22"/>
         </w:rPr>
-        <w:t xml:space="preserve">New clients trust CMT more when they can see who already works with you.</w:t>
+        <w:t xml:space="preserve">Thank you for the full client list. All of them now appear on the Our Clients page, grouped by sector.</w:t>
       </w:r>
     </w:p>
     <w:tbl>
@@ -4228,7 +4373,7 @@
                 <w:sz w:val="22"/>
                 <w:szCs w:val="22"/>
               </w:rPr>
-              <w:t xml:space="preserve">Which other clients may we name?</w:t>
+              <w:t xml:space="preserve">What do "PLC", "HCH" and "EFC – MDI" stand for?</w:t>
             </w:r>
           </w:p>
         </w:tc>
@@ -4259,7 +4404,7 @@
                 <w:sz w:val="20"/>
                 <w:szCs w:val="20"/>
               </w:rPr>
-              <w:t xml:space="preserve">CMT mentions more than 20 institutions; the site shows the 14 whose logos are already public. Please send any others you are happy for us to show.</w:t>
+              <w:t xml:space="preserve">They are on your client list, but we could not tell which organisations they are, so we have left them off the site until we know.</w:t>
             </w:r>
           </w:p>
         </w:tc>
@@ -4362,7 +4507,7 @@
                 <w:sz w:val="22"/>
                 <w:szCs w:val="22"/>
               </w:rPr>
-              <w:t xml:space="preserve">Are EXIM Bank and Uganda Development Bank current clients?</w:t>
+              <w:t xml:space="preserve">Please check the client names as we have written them</w:t>
             </w:r>
           </w:p>
         </w:tc>
@@ -4394,7 +4539,7 @@
                 <w:sz w:val="20"/>
                 <w:szCs w:val="20"/>
               </w:rPr>
-              <w:t xml:space="preserve">Also, should UN Federal Credit Union be listed with the banks, or with the corporate partners?</w:t>
+              <w:t xml:space="preserve">We used each organisation’s own spelling, for example "Ecobank" for "Eco Bank", "TotalEnergies" for "Total Energies", and "National Water and Sewerage Corporation". You can see the full list on the Our Clients page.</w:t>
             </w:r>
           </w:p>
         </w:tc>
@@ -4885,7 +5030,7 @@
                 <w:sz w:val="22"/>
                 <w:szCs w:val="22"/>
               </w:rPr>
-              <w:t xml:space="preserve">Team headshots</w:t>
+              <w:t xml:space="preserve">Headshots of the six registered valuers</w:t>
             </w:r>
           </w:p>
         </w:tc>
@@ -4917,7 +5062,7 @@
                 <w:sz w:val="20"/>
                 <w:szCs w:val="20"/>
               </w:rPr>
-              <w:t xml:space="preserve">One photo of each person on the site: head and shoulders, a plain light background, looking at the camera. The same style for everyone.</w:t>
+              <w:t xml:space="preserve">Head and shoulders, a plain light background, looking at the camera. The same style for everyone, so the team page looks like one team.</w:t>
             </w:r>
           </w:p>
         </w:tc>
@@ -4948,7 +5093,7 @@
                 <w:sz w:val="20"/>
                 <w:szCs w:val="20"/>
               </w:rPr>
-              <w:t xml:space="preserve">Everyone</w:t>
+              <w:t xml:space="preserve">6</w:t>
             </w:r>
           </w:p>
         </w:tc>

</xml_diff>